<commit_message>
add changes to dokumentacija and add start of code
</commit_message>
<xml_diff>
--- a/dokumentacija/funkcionalni_zahtjevi_i_model_podataka.docx
+++ b/dokumentacija/funkcionalni_zahtjevi_i_model_podataka.docx
@@ -2653,7 +2653,7 @@
                 <w:sz w:val="20"/>
                 <w:szCs w:val="20"/>
               </w:rPr>
-              <w:t>Korisnik</w:t>
+              <w:t>Korisnik može uploadati</w:t>
             </w:r>
             <w:r>
               <w:rPr>
@@ -2662,12 +2662,29 @@
               </w:rPr>
               <w:t xml:space="preserve"> </w:t>
             </w:r>
-            <w:r>
-              <w:rPr>
-                <w:sz w:val="20"/>
-                <w:szCs w:val="20"/>
-              </w:rPr>
-              <w:t>može</w:t>
+            <w:commentRangeStart w:id="2"/>
+            <w:r>
+              <w:rPr>
+                <w:sz w:val="20"/>
+                <w:szCs w:val="20"/>
+              </w:rPr>
+              <w:t xml:space="preserve">MIDI datoteku </w:t>
+            </w:r>
+            <w:commentRangeEnd w:id="2"/>
+            <w:r>
+              <w:rPr>
+                <w:rStyle w:val="CommentReference"/>
+                <w:sz w:val="20"/>
+                <w:szCs w:val="20"/>
+              </w:rPr>
+              <w:commentReference w:id="2"/>
+            </w:r>
+            <w:r>
+              <w:rPr>
+                <w:sz w:val="20"/>
+                <w:szCs w:val="20"/>
+              </w:rPr>
+              <w:t>uz svaku pjesmu za korištenje u modulu za učenje</w:t>
             </w:r>
             <w:r>
               <w:rPr>
@@ -2676,194 +2693,41 @@
               </w:rPr>
               <w:t xml:space="preserve"> </w:t>
             </w:r>
-            <w:r>
-              <w:rPr>
-                <w:sz w:val="20"/>
-                <w:szCs w:val="20"/>
-              </w:rPr>
-              <w:t>uploadati</w:t>
-            </w:r>
-            <w:r>
-              <w:rPr>
-                <w:sz w:val="20"/>
-                <w:szCs w:val="20"/>
-              </w:rPr>
-              <w:t xml:space="preserve"> </w:t>
-            </w:r>
-            <w:commentRangeStart w:id="2"/>
-            <w:r>
-              <w:rPr>
-                <w:sz w:val="20"/>
-                <w:szCs w:val="20"/>
-              </w:rPr>
-              <w:t xml:space="preserve">MIDI </w:t>
-            </w:r>
-            <w:r>
-              <w:rPr>
-                <w:sz w:val="20"/>
-                <w:szCs w:val="20"/>
-              </w:rPr>
-              <w:t>datoteku</w:t>
-            </w:r>
-            <w:r>
-              <w:rPr>
-                <w:sz w:val="20"/>
-                <w:szCs w:val="20"/>
-              </w:rPr>
-              <w:t xml:space="preserve"> </w:t>
-            </w:r>
-            <w:commentRangeEnd w:id="2"/>
+            <w:commentRangeStart w:id="3"/>
+            <w:r>
+              <w:rPr>
+                <w:sz w:val="20"/>
+                <w:szCs w:val="20"/>
+              </w:rPr>
+              <w:t>također moguć</w:t>
+            </w:r>
+            <w:r>
+              <w:rPr>
+                <w:sz w:val="20"/>
+                <w:szCs w:val="20"/>
+              </w:rPr>
+              <w:t xml:space="preserve">e </w:t>
+            </w:r>
+            <w:r>
+              <w:rPr>
+                <w:sz w:val="20"/>
+                <w:szCs w:val="20"/>
+              </w:rPr>
+              <w:t xml:space="preserve">je </w:t>
+            </w:r>
+            <w:r>
+              <w:rPr>
+                <w:sz w:val="20"/>
+                <w:szCs w:val="20"/>
+              </w:rPr>
+              <w:t xml:space="preserve">učitati </w:t>
+            </w:r>
+            <w:commentRangeEnd w:id="3"/>
             <w:r>
               <w:rPr>
                 <w:rStyle w:val="CommentReference"/>
-              </w:rPr>
-              <w:commentReference w:id="2"/>
-            </w:r>
-            <w:r>
-              <w:rPr>
-                <w:sz w:val="20"/>
-                <w:szCs w:val="20"/>
-              </w:rPr>
-              <w:t>uz</w:t>
-            </w:r>
-            <w:r>
-              <w:rPr>
-                <w:sz w:val="20"/>
-                <w:szCs w:val="20"/>
-              </w:rPr>
-              <w:t xml:space="preserve"> </w:t>
-            </w:r>
-            <w:r>
-              <w:rPr>
-                <w:sz w:val="20"/>
-                <w:szCs w:val="20"/>
-              </w:rPr>
-              <w:t>svaku</w:t>
-            </w:r>
-            <w:r>
-              <w:rPr>
-                <w:sz w:val="20"/>
-                <w:szCs w:val="20"/>
-              </w:rPr>
-              <w:t xml:space="preserve"> </w:t>
-            </w:r>
-            <w:r>
-              <w:rPr>
-                <w:sz w:val="20"/>
-                <w:szCs w:val="20"/>
-              </w:rPr>
-              <w:t>pjesmu</w:t>
-            </w:r>
-            <w:r>
-              <w:rPr>
-                <w:sz w:val="20"/>
-                <w:szCs w:val="20"/>
-              </w:rPr>
-              <w:t xml:space="preserve"> za </w:t>
-            </w:r>
-            <w:r>
-              <w:rPr>
-                <w:sz w:val="20"/>
-                <w:szCs w:val="20"/>
-              </w:rPr>
-              <w:t>korištenje</w:t>
-            </w:r>
-            <w:r>
-              <w:rPr>
-                <w:sz w:val="20"/>
-                <w:szCs w:val="20"/>
-              </w:rPr>
-              <w:t xml:space="preserve"> u </w:t>
-            </w:r>
-            <w:r>
-              <w:rPr>
-                <w:sz w:val="20"/>
-                <w:szCs w:val="20"/>
-              </w:rPr>
-              <w:t>modulu</w:t>
-            </w:r>
-            <w:r>
-              <w:rPr>
-                <w:sz w:val="20"/>
-                <w:szCs w:val="20"/>
-              </w:rPr>
-              <w:t xml:space="preserve"> za </w:t>
-            </w:r>
-            <w:r>
-              <w:rPr>
-                <w:sz w:val="20"/>
-                <w:szCs w:val="20"/>
-              </w:rPr>
-              <w:t>učenje</w:t>
-            </w:r>
-            <w:r>
-              <w:rPr>
-                <w:sz w:val="20"/>
-                <w:szCs w:val="20"/>
-              </w:rPr>
-              <w:t xml:space="preserve"> </w:t>
-            </w:r>
-            <w:commentRangeStart w:id="3"/>
-            <w:r>
-              <w:rPr>
-                <w:sz w:val="20"/>
-                <w:szCs w:val="20"/>
-              </w:rPr>
-              <w:t>također</w:t>
-            </w:r>
-            <w:r>
-              <w:rPr>
-                <w:sz w:val="20"/>
-                <w:szCs w:val="20"/>
-              </w:rPr>
-              <w:t xml:space="preserve"> </w:t>
-            </w:r>
-            <w:r>
-              <w:rPr>
-                <w:sz w:val="20"/>
-                <w:szCs w:val="20"/>
-              </w:rPr>
-              <w:t>moguć</w:t>
-            </w:r>
-            <w:r>
-              <w:rPr>
-                <w:sz w:val="20"/>
-                <w:szCs w:val="20"/>
-              </w:rPr>
-              <w:t>e</w:t>
-            </w:r>
-            <w:r>
-              <w:rPr>
-                <w:sz w:val="20"/>
-                <w:szCs w:val="20"/>
-              </w:rPr>
-              <w:t xml:space="preserve"> </w:t>
-            </w:r>
-            <w:r>
-              <w:rPr>
-                <w:sz w:val="20"/>
-                <w:szCs w:val="20"/>
-              </w:rPr>
-              <w:t xml:space="preserve">je </w:t>
-            </w:r>
-            <w:r>
-              <w:rPr>
-                <w:sz w:val="20"/>
-                <w:szCs w:val="20"/>
-              </w:rPr>
-              <w:t>učitati</w:t>
-            </w:r>
-            <w:r>
-              <w:rPr>
-                <w:sz w:val="20"/>
-                <w:szCs w:val="20"/>
-              </w:rPr>
-              <w:t xml:space="preserve"> </w:t>
-            </w:r>
-            <w:commentRangeEnd w:id="3"/>
-            <w:r>
-              <w:rPr>
-                <w:rStyle w:val="CommentReference"/>
+                <w:sz w:val="20"/>
+                <w:szCs w:val="20"/>
               </w:rPr>
               <w:commentReference w:id="3"/>
             </w:r>
@@ -2872,14 +2736,7 @@
                 <w:sz w:val="20"/>
                 <w:szCs w:val="20"/>
               </w:rPr>
-              <w:t xml:space="preserve">audio </w:t>
-            </w:r>
-            <w:r>
-              <w:rPr>
-                <w:sz w:val="20"/>
-                <w:szCs w:val="20"/>
-              </w:rPr>
-              <w:t>snimk</w:t>
+              <w:t>audio snimk</w:t>
             </w:r>
             <w:r>
               <w:rPr>
@@ -2893,77 +2750,14 @@
                 <w:sz w:val="20"/>
                 <w:szCs w:val="20"/>
               </w:rPr>
-              <w:t xml:space="preserve"> </w:t>
-            </w:r>
-            <w:r>
-              <w:rPr>
-                <w:sz w:val="20"/>
-                <w:szCs w:val="20"/>
-              </w:rPr>
-              <w:t>koja</w:t>
-            </w:r>
-            <w:r>
-              <w:rPr>
-                <w:sz w:val="20"/>
-                <w:szCs w:val="20"/>
-              </w:rPr>
-              <w:t xml:space="preserve"> se </w:t>
-            </w:r>
-            <w:r>
-              <w:rPr>
-                <w:sz w:val="20"/>
-                <w:szCs w:val="20"/>
-              </w:rPr>
-              <w:t>automatskom</w:t>
-            </w:r>
-            <w:r>
-              <w:rPr>
-                <w:sz w:val="20"/>
-                <w:szCs w:val="20"/>
-              </w:rPr>
-              <w:t xml:space="preserve"> </w:t>
-            </w:r>
-            <w:r>
-              <w:rPr>
-                <w:sz w:val="20"/>
-                <w:szCs w:val="20"/>
-              </w:rPr>
-              <w:t>konverzijom</w:t>
-            </w:r>
-            <w:r>
-              <w:rPr>
-                <w:sz w:val="20"/>
-                <w:szCs w:val="20"/>
-              </w:rPr>
-              <w:t xml:space="preserve"> </w:t>
-            </w:r>
-            <w:r>
-              <w:rPr>
-                <w:sz w:val="20"/>
-                <w:szCs w:val="20"/>
-              </w:rPr>
-              <w:t>pretvori</w:t>
-            </w:r>
-            <w:r>
-              <w:rPr>
-                <w:sz w:val="20"/>
-                <w:szCs w:val="20"/>
-              </w:rPr>
-              <w:t xml:space="preserve"> </w:t>
-            </w:r>
-            <w:r>
-              <w:rPr>
-                <w:sz w:val="20"/>
-                <w:szCs w:val="20"/>
-              </w:rPr>
-              <w:t xml:space="preserve">u MIDI </w:t>
-            </w:r>
-            <w:r>
-              <w:rPr>
-                <w:sz w:val="20"/>
-                <w:szCs w:val="20"/>
-              </w:rPr>
-              <w:t>oblik</w:t>
+              <w:t xml:space="preserve"> koja se automatskom konverzijom pretvori </w:t>
+            </w:r>
+            <w:r>
+              <w:rPr>
+                <w:sz w:val="20"/>
+                <w:szCs w:val="20"/>
+              </w:rPr>
+              <w:t>u MIDI oblik</w:t>
             </w:r>
             <w:r>
               <w:rPr>
@@ -9118,10 +8912,10 @@
         <w:tblLook w:val="04A0" w:firstRow="1" w:lastRow="0" w:firstColumn="1" w:lastColumn="0" w:noHBand="0" w:noVBand="1"/>
       </w:tblPr>
       <w:tblGrid>
-        <w:gridCol w:w="2391"/>
-        <w:gridCol w:w="1790"/>
-        <w:gridCol w:w="1160"/>
-        <w:gridCol w:w="3685"/>
+        <w:gridCol w:w="2200"/>
+        <w:gridCol w:w="1800"/>
+        <w:gridCol w:w="1200"/>
+        <w:gridCol w:w="3826"/>
       </w:tblGrid>
       <w:tr>
         <w:tc>
@@ -9769,78 +9563,66 @@
             </w:tcMar>
           </w:tcPr>
           <w:p>
+            <w:r>
+              <w:rPr>
+                <w:sz w:val="20"/>
+                <w:szCs w:val="20"/>
+              </w:rPr>
+              <w:t>artist_id</w:t>
+            </w:r>
+          </w:p>
+        </w:tc>
+        <w:tc>
+          <w:tcPr>
+            <w:tcW w:w="1800" w:type="dxa"/>
+            <w:tcBorders>
+              <w:top w:val="single" w:color="AAAAAA" w:sz="1" w:space="0"/>
+              <w:left w:val="single" w:color="AAAAAA" w:sz="1" w:space="0"/>
+              <w:bottom w:val="single" w:color="AAAAAA" w:sz="1" w:space="0"/>
+              <w:right w:val="single" w:color="AAAAAA" w:sz="1" w:space="0"/>
+            </w:tcBorders>
+            <w:tcMar>
+              <w:top w:w="60" w:type="dxa"/>
+              <w:left w:w="100" w:type="dxa"/>
+              <w:bottom w:w="60" w:type="dxa"/>
+              <w:right w:w="100" w:type="dxa"/>
+            </w:tcMar>
+          </w:tcPr>
+          <w:p>
+            <w:r>
+              <w:rPr>
+                <w:sz w:val="20"/>
+                <w:szCs w:val="20"/>
+              </w:rPr>
+              <w:t>UUID (FK)</w:t>
+            </w:r>
+          </w:p>
+        </w:tc>
+        <w:tc>
+          <w:tcPr>
+            <w:tcW w:w="1200" w:type="dxa"/>
+            <w:tcBorders>
+              <w:top w:val="single" w:color="AAAAAA" w:sz="1" w:space="0"/>
+              <w:left w:val="single" w:color="AAAAAA" w:sz="1" w:space="0"/>
+              <w:bottom w:val="single" w:color="AAAAAA" w:sz="1" w:space="0"/>
+              <w:right w:val="single" w:color="AAAAAA" w:sz="1" w:space="0"/>
+            </w:tcBorders>
+            <w:tcMar>
+              <w:top w:w="60" w:type="dxa"/>
+              <w:left w:w="100" w:type="dxa"/>
+              <w:bottom w:w="60" w:type="dxa"/>
+              <w:right w:w="100" w:type="dxa"/>
+            </w:tcMar>
+          </w:tcPr>
+          <w:p>
             <w:pPr>
-              <w:pStyle w:val="Normal"/>
+              <w:rPr>
+                <w:sz w:val="20"/>
+                <w:szCs w:val="20"/>
+              </w:rPr>
             </w:pPr>
             <w:r>
               <w:rPr>
-                <w:rFonts w:ascii="Arial" w:hAnsi="Arial" w:eastAsia="Arial" w:cs="Arial"/>
-                <w:noProof w:val="0"/>
-                <w:sz w:val="20"/>
-                <w:szCs w:val="20"/>
-                <w:lang w:val="en-US"/>
-              </w:rPr>
-              <w:t>artist_id</w:t>
-            </w:r>
-          </w:p>
-        </w:tc>
-        <w:tc>
-          <w:tcPr>
-            <w:tcW w:w="1800" w:type="dxa"/>
-            <w:tcBorders>
-              <w:top w:val="single" w:color="AAAAAA" w:sz="1" w:space="0"/>
-              <w:left w:val="single" w:color="AAAAAA" w:sz="1" w:space="0"/>
-              <w:bottom w:val="single" w:color="AAAAAA" w:sz="1" w:space="0"/>
-              <w:right w:val="single" w:color="AAAAAA" w:sz="1" w:space="0"/>
-            </w:tcBorders>
-            <w:tcMar>
-              <w:top w:w="60" w:type="dxa"/>
-              <w:left w:w="100" w:type="dxa"/>
-              <w:bottom w:w="60" w:type="dxa"/>
-              <w:right w:w="100" w:type="dxa"/>
-            </w:tcMar>
-          </w:tcPr>
-          <w:p>
-            <w:pPr>
-              <w:pStyle w:val="Normal"/>
-            </w:pPr>
-            <w:r>
-              <w:rPr>
-                <w:rFonts w:ascii="Arial" w:hAnsi="Arial" w:eastAsia="Arial" w:cs="Arial"/>
-                <w:noProof w:val="0"/>
-                <w:sz w:val="20"/>
-                <w:szCs w:val="20"/>
-                <w:lang w:val="en-US"/>
-              </w:rPr>
-              <w:t>UUID (FK)</w:t>
-            </w:r>
-          </w:p>
-        </w:tc>
-        <w:tc>
-          <w:tcPr>
-            <w:tcW w:w="1200" w:type="dxa"/>
-            <w:tcBorders>
-              <w:top w:val="single" w:color="AAAAAA" w:sz="1" w:space="0"/>
-              <w:left w:val="single" w:color="AAAAAA" w:sz="1" w:space="0"/>
-              <w:bottom w:val="single" w:color="AAAAAA" w:sz="1" w:space="0"/>
-              <w:right w:val="single" w:color="AAAAAA" w:sz="1" w:space="0"/>
-            </w:tcBorders>
-            <w:tcMar>
-              <w:top w:w="60" w:type="dxa"/>
-              <w:left w:w="100" w:type="dxa"/>
-              <w:bottom w:w="60" w:type="dxa"/>
-              <w:right w:w="100" w:type="dxa"/>
-            </w:tcMar>
-          </w:tcPr>
-          <w:p>
-            <w:pPr>
-              <w:rPr>
-                <w:sz w:val="20"/>
-                <w:szCs w:val="20"/>
-              </w:rPr>
-            </w:pPr>
-            <w:r>
-              <w:rPr>
                 <w:sz w:val="20"/>
                 <w:szCs w:val="20"/>
               </w:rPr>
@@ -9865,16 +9647,10 @@
             </w:tcMar>
           </w:tcPr>
           <w:p>
-            <w:pPr>
-              <w:pStyle w:val="Normal"/>
-            </w:pPr>
-            <w:r>
-              <w:rPr>
-                <w:rFonts w:ascii="Arial" w:hAnsi="Arial" w:eastAsia="Arial" w:cs="Arial"/>
-                <w:noProof w:val="0"/>
-                <w:sz w:val="20"/>
-                <w:szCs w:val="20"/>
-                <w:lang w:val="en-US"/>
+            <w:r>
+              <w:rPr>
+                <w:sz w:val="20"/>
+                <w:szCs w:val="20"/>
               </w:rPr>
               <w:t>FK → Artist.id</w:t>
             </w:r>
@@ -10005,7 +9781,7 @@
             </w:tcMar>
           </w:tcPr>
           <w:p>
-            <w:commentRangeStart w:id="14"/>
+            <w:commentRangeStart w:id="11"/>
             <w:r>
               <w:rPr>
                 <w:sz w:val="20"/>
@@ -10013,14 +9789,14 @@
               </w:rPr>
               <w:t>key_signature</w:t>
             </w:r>
-            <w:commentRangeEnd w:id="14"/>
+            <w:commentRangeEnd w:id="11"/>
             <w:r>
               <w:rPr>
                 <w:rStyle w:val="CommentReference"/>
                 <w:sz w:val="20"/>
                 <w:szCs w:val="20"/>
               </w:rPr>
-              <w:commentReference w:id="14"/>
+              <w:commentReference w:id="11"/>
             </w:r>
             <w:r>
               <w:rPr>
@@ -11075,20 +10851,13 @@
         <w:pStyle w:val="Heading2"/>
       </w:pPr>
       <w:r>
-        <w:rPr/>
         <w:t>3.3.</w:t>
       </w:r>
       <w:r>
-        <w:rPr/>
         <w:t>1</w:t>
       </w:r>
       <w:r>
-        <w:rPr/>
-        <w:t xml:space="preserve"> </w:t>
-      </w:r>
-      <w:r>
-        <w:rPr/>
-        <w:t>KeySignature</w:t>
+        <w:t xml:space="preserve"> KeySignature</w:t>
       </w:r>
     </w:p>
     <w:p>
@@ -11814,13 +11583,7 @@
         <w:rPr>
           <w:lang w:val="pl-PL"/>
         </w:rPr>
-        <w:t xml:space="preserve"> </w:t>
-      </w:r>
-      <w:r>
-        <w:rPr>
-          <w:lang w:val="pl-PL"/>
-        </w:rPr>
-        <w:t>CompositionTargetArea</w:t>
+        <w:t xml:space="preserve"> CompositionTargetArea</w:t>
       </w:r>
     </w:p>
     <w:p>
@@ -12637,20 +12400,20 @@
       <w:tblPr>
         <w:tblW w:w="0" w:type="auto"/>
         <w:tblBorders>
-          <w:top w:val="single" w:color="auto" w:sz="4"/>
-          <w:left w:val="single" w:color="auto" w:sz="4"/>
-          <w:bottom w:val="single" w:color="auto" w:sz="4"/>
-          <w:right w:val="single" w:color="auto" w:sz="4"/>
-          <w:insideH w:val="single" w:color="auto" w:sz="4"/>
-          <w:insideV w:val="single" w:color="auto" w:sz="4"/>
+          <w:top w:val="single" w:color="auto" w:sz="4" w:space="0"/>
+          <w:left w:val="single" w:color="auto" w:sz="4" w:space="0"/>
+          <w:bottom w:val="single" w:color="auto" w:sz="4" w:space="0"/>
+          <w:right w:val="single" w:color="auto" w:sz="4" w:space="0"/>
+          <w:insideH w:val="single" w:color="auto" w:sz="4" w:space="0"/>
+          <w:insideV w:val="single" w:color="auto" w:sz="4" w:space="0"/>
         </w:tblBorders>
         <w:tblLook w:val="04A0" w:firstRow="1" w:lastRow="0" w:firstColumn="1" w:lastColumn="0" w:noHBand="0" w:noVBand="1"/>
       </w:tblPr>
       <w:tblGrid>
-        <w:gridCol w:w="2200"/>
+        <w:gridCol w:w="2199"/>
         <w:gridCol w:w="1800"/>
         <w:gridCol w:w="1200"/>
-        <w:gridCol w:w="3826"/>
+        <w:gridCol w:w="3825"/>
       </w:tblGrid>
       <w:tr>
         <w:trPr>
@@ -12660,10 +12423,10 @@
           <w:tcPr>
             <w:tcW w:w="2200" w:type="dxa"/>
             <w:tcBorders>
-              <w:top w:val="single" w:color="AAAAAA" w:sz="1"/>
-              <w:left w:val="single" w:color="AAAAAA" w:sz="1"/>
-              <w:bottom w:val="single" w:color="AAAAAA" w:sz="1"/>
-              <w:right w:val="single" w:color="AAAAAA" w:sz="1"/>
+              <w:top w:val="single" w:color="AAAAAA" w:sz="1" w:space="0"/>
+              <w:left w:val="single" w:color="AAAAAA" w:sz="1" w:space="0"/>
+              <w:bottom w:val="single" w:color="AAAAAA" w:sz="1" w:space="0"/>
+              <w:right w:val="single" w:color="AAAAAA" w:sz="1" w:space="0"/>
             </w:tcBorders>
             <w:shd w:val="clear" w:color="auto" w:fill="2B579A"/>
             <w:tcMar>
@@ -12680,9 +12443,9 @@
             </w:pPr>
             <w:r>
               <w:rPr>
-                <w:b w:val="1"/>
-                <w:bCs w:val="1"/>
-                <w:color w:val="FFFFFF" w:themeColor="background1" w:themeTint="FF" w:themeShade="FF"/>
+                <w:b/>
+                <w:bCs/>
+                <w:color w:val="FFFFFF" w:themeColor="background1"/>
                 <w:sz w:val="20"/>
                 <w:szCs w:val="20"/>
               </w:rPr>
@@ -12694,10 +12457,10 @@
           <w:tcPr>
             <w:tcW w:w="1800" w:type="dxa"/>
             <w:tcBorders>
-              <w:top w:val="single" w:color="AAAAAA" w:sz="1"/>
-              <w:left w:val="single" w:color="AAAAAA" w:sz="1"/>
-              <w:bottom w:val="single" w:color="AAAAAA" w:sz="1"/>
-              <w:right w:val="single" w:color="AAAAAA" w:sz="1"/>
+              <w:top w:val="single" w:color="AAAAAA" w:sz="1" w:space="0"/>
+              <w:left w:val="single" w:color="AAAAAA" w:sz="1" w:space="0"/>
+              <w:bottom w:val="single" w:color="AAAAAA" w:sz="1" w:space="0"/>
+              <w:right w:val="single" w:color="AAAAAA" w:sz="1" w:space="0"/>
             </w:tcBorders>
             <w:shd w:val="clear" w:color="auto" w:fill="2B579A"/>
             <w:tcMar>
@@ -12714,9 +12477,9 @@
             </w:pPr>
             <w:r>
               <w:rPr>
-                <w:b w:val="1"/>
-                <w:bCs w:val="1"/>
-                <w:color w:val="FFFFFF" w:themeColor="background1" w:themeTint="FF" w:themeShade="FF"/>
+                <w:b/>
+                <w:bCs/>
+                <w:color w:val="FFFFFF" w:themeColor="background1"/>
                 <w:sz w:val="20"/>
                 <w:szCs w:val="20"/>
               </w:rPr>
@@ -12728,10 +12491,10 @@
           <w:tcPr>
             <w:tcW w:w="1200" w:type="dxa"/>
             <w:tcBorders>
-              <w:top w:val="single" w:color="AAAAAA" w:sz="1"/>
-              <w:left w:val="single" w:color="AAAAAA" w:sz="1"/>
-              <w:bottom w:val="single" w:color="AAAAAA" w:sz="1"/>
-              <w:right w:val="single" w:color="AAAAAA" w:sz="1"/>
+              <w:top w:val="single" w:color="AAAAAA" w:sz="1" w:space="0"/>
+              <w:left w:val="single" w:color="AAAAAA" w:sz="1" w:space="0"/>
+              <w:bottom w:val="single" w:color="AAAAAA" w:sz="1" w:space="0"/>
+              <w:right w:val="single" w:color="AAAAAA" w:sz="1" w:space="0"/>
             </w:tcBorders>
             <w:shd w:val="clear" w:color="auto" w:fill="2B579A"/>
             <w:tcMar>
@@ -12748,9 +12511,9 @@
             </w:pPr>
             <w:r>
               <w:rPr>
-                <w:b w:val="1"/>
-                <w:bCs w:val="1"/>
-                <w:color w:val="FFFFFF" w:themeColor="background1" w:themeTint="FF" w:themeShade="FF"/>
+                <w:b/>
+                <w:bCs/>
+                <w:color w:val="FFFFFF" w:themeColor="background1"/>
                 <w:sz w:val="20"/>
                 <w:szCs w:val="20"/>
               </w:rPr>
@@ -12762,10 +12525,10 @@
           <w:tcPr>
             <w:tcW w:w="3826" w:type="dxa"/>
             <w:tcBorders>
-              <w:top w:val="single" w:color="AAAAAA" w:sz="1"/>
-              <w:left w:val="single" w:color="AAAAAA" w:sz="1"/>
-              <w:bottom w:val="single" w:color="AAAAAA" w:sz="1"/>
-              <w:right w:val="single" w:color="AAAAAA" w:sz="1"/>
+              <w:top w:val="single" w:color="AAAAAA" w:sz="1" w:space="0"/>
+              <w:left w:val="single" w:color="AAAAAA" w:sz="1" w:space="0"/>
+              <w:bottom w:val="single" w:color="AAAAAA" w:sz="1" w:space="0"/>
+              <w:right w:val="single" w:color="AAAAAA" w:sz="1" w:space="0"/>
             </w:tcBorders>
             <w:shd w:val="clear" w:color="auto" w:fill="2B579A"/>
             <w:tcMar>
@@ -12782,9 +12545,9 @@
             </w:pPr>
             <w:r>
               <w:rPr>
-                <w:b w:val="1"/>
-                <w:bCs w:val="1"/>
-                <w:color w:val="FFFFFF" w:themeColor="background1" w:themeTint="FF" w:themeShade="FF"/>
+                <w:b/>
+                <w:bCs/>
+                <w:color w:val="FFFFFF" w:themeColor="background1"/>
                 <w:sz w:val="20"/>
                 <w:szCs w:val="20"/>
               </w:rPr>
@@ -12801,23 +12564,23 @@
           <w:tcPr>
             <w:tcW w:w="2200" w:type="dxa"/>
             <w:tcBorders>
-              <w:top w:val="single" w:color="AAAAAA" w:sz="1"/>
-              <w:left w:val="single" w:color="AAAAAA" w:sz="1"/>
-              <w:bottom w:val="single" w:color="AAAAAA" w:sz="1"/>
-              <w:right w:val="single" w:color="AAAAAA" w:sz="1"/>
-            </w:tcBorders>
-            <w:tcMar>
-              <w:top w:w="60" w:type="dxa"/>
-              <w:left w:w="100" w:type="dxa"/>
-              <w:bottom w:w="60" w:type="dxa"/>
-              <w:right w:w="100" w:type="dxa"/>
-            </w:tcMar>
-          </w:tcPr>
-          <w:p>
-            <w:r>
-              <w:rPr>
-                <w:b w:val="1"/>
-                <w:bCs w:val="1"/>
+              <w:top w:val="single" w:color="AAAAAA" w:sz="1" w:space="0"/>
+              <w:left w:val="single" w:color="AAAAAA" w:sz="1" w:space="0"/>
+              <w:bottom w:val="single" w:color="AAAAAA" w:sz="1" w:space="0"/>
+              <w:right w:val="single" w:color="AAAAAA" w:sz="1" w:space="0"/>
+            </w:tcBorders>
+            <w:tcMar>
+              <w:top w:w="60" w:type="dxa"/>
+              <w:left w:w="100" w:type="dxa"/>
+              <w:bottom w:w="60" w:type="dxa"/>
+              <w:right w:w="100" w:type="dxa"/>
+            </w:tcMar>
+          </w:tcPr>
+          <w:p>
+            <w:r>
+              <w:rPr>
+                <w:b/>
+                <w:bCs/>
                 <w:sz w:val="20"/>
                 <w:szCs w:val="20"/>
               </w:rPr>
@@ -12829,10 +12592,10 @@
           <w:tcPr>
             <w:tcW w:w="1800" w:type="dxa"/>
             <w:tcBorders>
-              <w:top w:val="single" w:color="AAAAAA" w:sz="1"/>
-              <w:left w:val="single" w:color="AAAAAA" w:sz="1"/>
-              <w:bottom w:val="single" w:color="AAAAAA" w:sz="1"/>
-              <w:right w:val="single" w:color="AAAAAA" w:sz="1"/>
+              <w:top w:val="single" w:color="AAAAAA" w:sz="1" w:space="0"/>
+              <w:left w:val="single" w:color="AAAAAA" w:sz="1" w:space="0"/>
+              <w:bottom w:val="single" w:color="AAAAAA" w:sz="1" w:space="0"/>
+              <w:right w:val="single" w:color="AAAAAA" w:sz="1" w:space="0"/>
             </w:tcBorders>
             <w:tcMar>
               <w:top w:w="60" w:type="dxa"/>
@@ -12855,10 +12618,10 @@
           <w:tcPr>
             <w:tcW w:w="1200" w:type="dxa"/>
             <w:tcBorders>
-              <w:top w:val="single" w:color="AAAAAA" w:sz="1"/>
-              <w:left w:val="single" w:color="AAAAAA" w:sz="1"/>
-              <w:bottom w:val="single" w:color="AAAAAA" w:sz="1"/>
-              <w:right w:val="single" w:color="AAAAAA" w:sz="1"/>
+              <w:top w:val="single" w:color="AAAAAA" w:sz="1" w:space="0"/>
+              <w:left w:val="single" w:color="AAAAAA" w:sz="1" w:space="0"/>
+              <w:bottom w:val="single" w:color="AAAAAA" w:sz="1" w:space="0"/>
+              <w:right w:val="single" w:color="AAAAAA" w:sz="1" w:space="0"/>
             </w:tcBorders>
             <w:tcMar>
               <w:top w:w="60" w:type="dxa"/>
@@ -12881,10 +12644,10 @@
           <w:tcPr>
             <w:tcW w:w="3826" w:type="dxa"/>
             <w:tcBorders>
-              <w:top w:val="single" w:color="AAAAAA" w:sz="1"/>
-              <w:left w:val="single" w:color="AAAAAA" w:sz="1"/>
-              <w:bottom w:val="single" w:color="AAAAAA" w:sz="1"/>
-              <w:right w:val="single" w:color="AAAAAA" w:sz="1"/>
+              <w:top w:val="single" w:color="AAAAAA" w:sz="1" w:space="0"/>
+              <w:left w:val="single" w:color="AAAAAA" w:sz="1" w:space="0"/>
+              <w:bottom w:val="single" w:color="AAAAAA" w:sz="1" w:space="0"/>
+              <w:right w:val="single" w:color="AAAAAA" w:sz="1" w:space="0"/>
             </w:tcBorders>
             <w:tcMar>
               <w:top w:w="60" w:type="dxa"/>
@@ -12912,10 +12675,88 @@
           <w:tcPr>
             <w:tcW w:w="2200" w:type="dxa"/>
             <w:tcBorders>
-              <w:top w:val="single" w:color="AAAAAA" w:sz="1"/>
-              <w:left w:val="single" w:color="AAAAAA" w:sz="1"/>
-              <w:bottom w:val="single" w:color="AAAAAA" w:sz="1"/>
-              <w:right w:val="single" w:color="AAAAAA" w:sz="1"/>
+              <w:top w:val="single" w:color="AAAAAA" w:sz="1" w:space="0"/>
+              <w:left w:val="single" w:color="AAAAAA" w:sz="1" w:space="0"/>
+              <w:bottom w:val="single" w:color="AAAAAA" w:sz="1" w:space="0"/>
+              <w:right w:val="single" w:color="AAAAAA" w:sz="1" w:space="0"/>
+            </w:tcBorders>
+            <w:tcMar>
+              <w:top w:w="60" w:type="dxa"/>
+              <w:left w:w="100" w:type="dxa"/>
+              <w:bottom w:w="60" w:type="dxa"/>
+              <w:right w:w="100" w:type="dxa"/>
+            </w:tcMar>
+          </w:tcPr>
+          <w:p>
+            <w:r>
+              <w:rPr>
+                <w:sz w:val="20"/>
+                <w:szCs w:val="20"/>
+              </w:rPr>
+              <w:t>name</w:t>
+            </w:r>
+          </w:p>
+        </w:tc>
+        <w:tc>
+          <w:tcPr>
+            <w:tcW w:w="1800" w:type="dxa"/>
+            <w:tcBorders>
+              <w:top w:val="single" w:color="AAAAAA" w:sz="1" w:space="0"/>
+              <w:left w:val="single" w:color="AAAAAA" w:sz="1" w:space="0"/>
+              <w:bottom w:val="single" w:color="AAAAAA" w:sz="1" w:space="0"/>
+              <w:right w:val="single" w:color="AAAAAA" w:sz="1" w:space="0"/>
+            </w:tcBorders>
+            <w:tcMar>
+              <w:top w:w="60" w:type="dxa"/>
+              <w:left w:w="100" w:type="dxa"/>
+              <w:bottom w:w="60" w:type="dxa"/>
+              <w:right w:w="100" w:type="dxa"/>
+            </w:tcMar>
+          </w:tcPr>
+          <w:p>
+            <w:r>
+              <w:rPr>
+                <w:sz w:val="20"/>
+                <w:szCs w:val="20"/>
+              </w:rPr>
+              <w:t>VARCHAR(255)</w:t>
+            </w:r>
+          </w:p>
+        </w:tc>
+        <w:tc>
+          <w:tcPr>
+            <w:tcW w:w="1200" w:type="dxa"/>
+            <w:tcBorders>
+              <w:top w:val="single" w:color="AAAAAA" w:sz="1" w:space="0"/>
+              <w:left w:val="single" w:color="AAAAAA" w:sz="1" w:space="0"/>
+              <w:bottom w:val="single" w:color="AAAAAA" w:sz="1" w:space="0"/>
+              <w:right w:val="single" w:color="AAAAAA" w:sz="1" w:space="0"/>
+            </w:tcBorders>
+            <w:tcMar>
+              <w:top w:w="60" w:type="dxa"/>
+              <w:left w:w="100" w:type="dxa"/>
+              <w:bottom w:w="60" w:type="dxa"/>
+              <w:right w:w="100" w:type="dxa"/>
+            </w:tcMar>
+          </w:tcPr>
+          <w:p>
+            <w:r>
+              <w:rPr>
+                <w:sz w:val="20"/>
+                <w:szCs w:val="20"/>
+              </w:rPr>
+              <w:t>NE</w:t>
+            </w:r>
+          </w:p>
+        </w:tc>
+        <w:tc>
+          <w:tcPr>
+            <w:tcW w:w="3826" w:type="dxa"/>
+            <w:tcBorders>
+              <w:top w:val="single" w:color="AAAAAA" w:sz="1" w:space="0"/>
+              <w:left w:val="single" w:color="AAAAAA" w:sz="1" w:space="0"/>
+              <w:bottom w:val="single" w:color="AAAAAA" w:sz="1" w:space="0"/>
+              <w:right w:val="single" w:color="AAAAAA" w:sz="1" w:space="0"/>
             </w:tcBorders>
             <w:tcMar>
               <w:top w:w="60" w:type="dxa"/>
@@ -12926,107 +12767,33 @@
           </w:tcPr>
           <w:p>
             <w:pPr>
-              <w:pStyle w:val="Normal"/>
+              <w:rPr>
+                <w:lang w:val="de-DE"/>
+              </w:rPr>
             </w:pPr>
             <w:r>
               <w:rPr>
-                <w:rFonts w:ascii="Arial" w:hAnsi="Arial" w:eastAsia="Arial" w:cs="Arial"/>
-                <w:noProof w:val="0"/>
-                <w:sz w:val="20"/>
-                <w:szCs w:val="20"/>
-                <w:lang w:val="en-US"/>
-              </w:rPr>
-              <w:t>name</w:t>
-            </w:r>
-          </w:p>
-        </w:tc>
-        <w:tc>
-          <w:tcPr>
-            <w:tcW w:w="1800" w:type="dxa"/>
-            <w:tcBorders>
-              <w:top w:val="single" w:color="AAAAAA" w:sz="1"/>
-              <w:left w:val="single" w:color="AAAAAA" w:sz="1"/>
-              <w:bottom w:val="single" w:color="AAAAAA" w:sz="1"/>
-              <w:right w:val="single" w:color="AAAAAA" w:sz="1"/>
-            </w:tcBorders>
-            <w:tcMar>
-              <w:top w:w="60" w:type="dxa"/>
-              <w:left w:w="100" w:type="dxa"/>
-              <w:bottom w:w="60" w:type="dxa"/>
-              <w:right w:w="100" w:type="dxa"/>
-            </w:tcMar>
-          </w:tcPr>
-          <w:p>
-            <w:pPr>
-              <w:pStyle w:val="Normal"/>
-            </w:pPr>
-            <w:r>
-              <w:rPr>
-                <w:rFonts w:ascii="Arial" w:hAnsi="Arial" w:eastAsia="Arial" w:cs="Arial"/>
-                <w:noProof w:val="0"/>
-                <w:sz w:val="20"/>
-                <w:szCs w:val="20"/>
-                <w:lang w:val="en-US"/>
-              </w:rPr>
-              <w:t>VARCHAR(255)</w:t>
-            </w:r>
-          </w:p>
-        </w:tc>
-        <w:tc>
-          <w:tcPr>
-            <w:tcW w:w="1200" w:type="dxa"/>
-            <w:tcBorders>
-              <w:top w:val="single" w:color="AAAAAA" w:sz="1"/>
-              <w:left w:val="single" w:color="AAAAAA" w:sz="1"/>
-              <w:bottom w:val="single" w:color="AAAAAA" w:sz="1"/>
-              <w:right w:val="single" w:color="AAAAAA" w:sz="1"/>
-            </w:tcBorders>
-            <w:tcMar>
-              <w:top w:w="60" w:type="dxa"/>
-              <w:left w:w="100" w:type="dxa"/>
-              <w:bottom w:w="60" w:type="dxa"/>
-              <w:right w:w="100" w:type="dxa"/>
-            </w:tcMar>
-          </w:tcPr>
-          <w:p>
-            <w:r>
-              <w:rPr>
-                <w:sz w:val="20"/>
-                <w:szCs w:val="20"/>
-              </w:rPr>
-              <w:t>NE</w:t>
-            </w:r>
-          </w:p>
-        </w:tc>
-        <w:tc>
-          <w:tcPr>
-            <w:tcW w:w="3826" w:type="dxa"/>
-            <w:tcBorders>
-              <w:top w:val="single" w:color="AAAAAA" w:sz="1"/>
-              <w:left w:val="single" w:color="AAAAAA" w:sz="1"/>
-              <w:bottom w:val="single" w:color="AAAAAA" w:sz="1"/>
-              <w:right w:val="single" w:color="AAAAAA" w:sz="1"/>
-            </w:tcBorders>
-            <w:tcMar>
-              <w:top w:w="60" w:type="dxa"/>
-              <w:left w:w="100" w:type="dxa"/>
-              <w:bottom w:w="60" w:type="dxa"/>
-              <w:right w:w="100" w:type="dxa"/>
-            </w:tcMar>
-          </w:tcPr>
-          <w:p>
-            <w:pPr>
-              <w:pStyle w:val="Normal"/>
-            </w:pPr>
-            <w:r>
-              <w:rPr>
-                <w:rFonts w:ascii="Arial" w:hAnsi="Arial" w:eastAsia="Arial" w:cs="Arial"/>
-                <w:noProof w:val="0"/>
-                <w:sz w:val="20"/>
-                <w:szCs w:val="20"/>
-                <w:lang w:val="en-US"/>
-              </w:rPr>
-              <w:t>Ime izvođača/benda</w:t>
+                <w:sz w:val="20"/>
+                <w:szCs w:val="20"/>
+                <w:lang w:val="de-DE"/>
+              </w:rPr>
+              <w:t>Ime izvođača</w:t>
+            </w:r>
+            <w:r>
+              <w:rPr>
+                <w:sz w:val="20"/>
+                <w:szCs w:val="20"/>
+                <w:lang w:val="de-DE"/>
+              </w:rPr>
+              <w:t xml:space="preserve"> (denormalizirano Prezime + ime)</w:t>
+            </w:r>
+            <w:r>
+              <w:rPr>
+                <w:sz w:val="20"/>
+                <w:szCs w:val="20"/>
+                <w:lang w:val="de-DE"/>
+              </w:rPr>
+              <w:t>/benda</w:t>
             </w:r>
           </w:p>
         </w:tc>
@@ -13039,10 +12806,62 @@
           <w:tcPr>
             <w:tcW w:w="2200" w:type="dxa"/>
             <w:tcBorders>
-              <w:top w:val="single" w:color="AAAAAA" w:sz="1"/>
-              <w:left w:val="single" w:color="AAAAAA" w:sz="1"/>
-              <w:bottom w:val="single" w:color="AAAAAA" w:sz="1"/>
-              <w:right w:val="single" w:color="AAAAAA" w:sz="1"/>
+              <w:top w:val="single" w:color="AAAAAA" w:sz="1" w:space="0"/>
+              <w:left w:val="single" w:color="AAAAAA" w:sz="1" w:space="0"/>
+              <w:bottom w:val="single" w:color="AAAAAA" w:sz="1" w:space="0"/>
+              <w:right w:val="single" w:color="AAAAAA" w:sz="1" w:space="0"/>
+            </w:tcBorders>
+            <w:tcMar>
+              <w:top w:w="60" w:type="dxa"/>
+              <w:left w:w="100" w:type="dxa"/>
+              <w:bottom w:w="60" w:type="dxa"/>
+              <w:right w:w="100" w:type="dxa"/>
+            </w:tcMar>
+          </w:tcPr>
+          <w:p>
+            <w:r>
+              <w:rPr>
+                <w:sz w:val="20"/>
+                <w:szCs w:val="20"/>
+              </w:rPr>
+              <w:t>created_at</w:t>
+            </w:r>
+          </w:p>
+        </w:tc>
+        <w:tc>
+          <w:tcPr>
+            <w:tcW w:w="1800" w:type="dxa"/>
+            <w:tcBorders>
+              <w:top w:val="single" w:color="AAAAAA" w:sz="1" w:space="0"/>
+              <w:left w:val="single" w:color="AAAAAA" w:sz="1" w:space="0"/>
+              <w:bottom w:val="single" w:color="AAAAAA" w:sz="1" w:space="0"/>
+              <w:right w:val="single" w:color="AAAAAA" w:sz="1" w:space="0"/>
+            </w:tcBorders>
+            <w:tcMar>
+              <w:top w:w="60" w:type="dxa"/>
+              <w:left w:w="100" w:type="dxa"/>
+              <w:bottom w:w="60" w:type="dxa"/>
+              <w:right w:w="100" w:type="dxa"/>
+            </w:tcMar>
+          </w:tcPr>
+          <w:p>
+            <w:r>
+              <w:rPr>
+                <w:sz w:val="20"/>
+                <w:szCs w:val="20"/>
+              </w:rPr>
+              <w:t>TIMESTAMP</w:t>
+            </w:r>
+          </w:p>
+        </w:tc>
+        <w:tc>
+          <w:tcPr>
+            <w:tcW w:w="1200" w:type="dxa"/>
+            <w:tcBorders>
+              <w:top w:val="single" w:color="AAAAAA" w:sz="1" w:space="0"/>
+              <w:left w:val="single" w:color="AAAAAA" w:sz="1" w:space="0"/>
+              <w:bottom w:val="single" w:color="AAAAAA" w:sz="1" w:space="0"/>
+              <w:right w:val="single" w:color="AAAAAA" w:sz="1" w:space="0"/>
             </w:tcBorders>
             <w:tcMar>
               <w:top w:w="60" w:type="dxa"/>
@@ -13053,81 +12872,17 @@
           </w:tcPr>
           <w:p>
             <w:pPr>
-              <w:pStyle w:val="Normal"/>
+              <w:rPr>
+                <w:sz w:val="20"/>
+                <w:szCs w:val="20"/>
+              </w:rPr>
             </w:pPr>
             <w:r>
               <w:rPr>
-                <w:rFonts w:ascii="Arial" w:hAnsi="Arial" w:eastAsia="Arial" w:cs="Arial"/>
-                <w:noProof w:val="0"/>
-                <w:sz w:val="20"/>
-                <w:szCs w:val="20"/>
-                <w:lang w:val="en-US"/>
-              </w:rPr>
-              <w:t>user_id</w:t>
-            </w:r>
-          </w:p>
-        </w:tc>
-        <w:tc>
-          <w:tcPr>
-            <w:tcW w:w="1800" w:type="dxa"/>
-            <w:tcBorders>
-              <w:top w:val="single" w:color="AAAAAA" w:sz="1"/>
-              <w:left w:val="single" w:color="AAAAAA" w:sz="1"/>
-              <w:bottom w:val="single" w:color="AAAAAA" w:sz="1"/>
-              <w:right w:val="single" w:color="AAAAAA" w:sz="1"/>
-            </w:tcBorders>
-            <w:tcMar>
-              <w:top w:w="60" w:type="dxa"/>
-              <w:left w:w="100" w:type="dxa"/>
-              <w:bottom w:w="60" w:type="dxa"/>
-              <w:right w:w="100" w:type="dxa"/>
-            </w:tcMar>
-          </w:tcPr>
-          <w:p>
-            <w:pPr>
-              <w:pStyle w:val="Normal"/>
-            </w:pPr>
-            <w:r>
-              <w:rPr>
-                <w:rFonts w:ascii="Arial" w:hAnsi="Arial" w:eastAsia="Arial" w:cs="Arial"/>
-                <w:noProof w:val="0"/>
-                <w:sz w:val="20"/>
-                <w:szCs w:val="20"/>
-                <w:lang w:val="en-US"/>
-              </w:rPr>
-              <w:t>UUID (FK)</w:t>
-            </w:r>
-          </w:p>
-        </w:tc>
-        <w:tc>
-          <w:tcPr>
-            <w:tcW w:w="1200" w:type="dxa"/>
-            <w:tcBorders>
-              <w:top w:val="single" w:color="AAAAAA" w:sz="1"/>
-              <w:left w:val="single" w:color="AAAAAA" w:sz="1"/>
-              <w:bottom w:val="single" w:color="AAAAAA" w:sz="1"/>
-              <w:right w:val="single" w:color="AAAAAA" w:sz="1"/>
-            </w:tcBorders>
-            <w:tcMar>
-              <w:top w:w="60" w:type="dxa"/>
-              <w:left w:w="100" w:type="dxa"/>
-              <w:bottom w:w="60" w:type="dxa"/>
-              <w:right w:w="100" w:type="dxa"/>
-            </w:tcMar>
-          </w:tcPr>
-          <w:p>
-            <w:pPr>
-              <w:pStyle w:val="Normal"/>
-            </w:pPr>
-            <w:r>
-              <w:rPr>
-                <w:rFonts w:ascii="Arial" w:hAnsi="Arial" w:eastAsia="Arial" w:cs="Arial"/>
-                <w:noProof w:val="0"/>
-                <w:sz w:val="20"/>
-                <w:szCs w:val="20"/>
-                <w:lang w:val="en-US"/>
-              </w:rPr>
-              <w:t>DA</w:t>
+                <w:sz w:val="20"/>
+                <w:szCs w:val="20"/>
+              </w:rPr>
+              <w:t>NE</w:t>
             </w:r>
           </w:p>
         </w:tc>
@@ -13135,162 +12890,23 @@
           <w:tcPr>
             <w:tcW w:w="3826" w:type="dxa"/>
             <w:tcBorders>
-              <w:top w:val="single" w:color="AAAAAA" w:sz="1"/>
-              <w:left w:val="single" w:color="AAAAAA" w:sz="1"/>
-              <w:bottom w:val="single" w:color="AAAAAA" w:sz="1"/>
-              <w:right w:val="single" w:color="AAAAAA" w:sz="1"/>
-            </w:tcBorders>
-            <w:tcMar>
-              <w:top w:w="60" w:type="dxa"/>
-              <w:left w:w="100" w:type="dxa"/>
-              <w:bottom w:w="60" w:type="dxa"/>
-              <w:right w:w="100" w:type="dxa"/>
-            </w:tcMar>
-          </w:tcPr>
-          <w:p>
-            <w:pPr>
-              <w:pStyle w:val="Normal"/>
-            </w:pPr>
-            <w:r>
-              <w:rPr>
-                <w:rFonts w:ascii="Arial" w:hAnsi="Arial" w:eastAsia="Arial" w:cs="Arial"/>
-                <w:noProof w:val="0"/>
-                <w:sz w:val="20"/>
-                <w:szCs w:val="20"/>
-                <w:lang w:val="en-US"/>
-              </w:rPr>
-              <w:t>FK → User.id (null = globalni katalog, s vrijednošću = korisnik ga sam dodao)</w:t>
-            </w:r>
-          </w:p>
-        </w:tc>
-      </w:tr>
-      <w:tr>
-        <w:trPr>
-          <w:trHeight w:val="300"/>
-        </w:trPr>
-        <w:tc>
-          <w:tcPr>
-            <w:tcW w:w="2200" w:type="dxa"/>
-            <w:tcBorders>
-              <w:top w:val="single" w:color="AAAAAA" w:sz="1"/>
-              <w:left w:val="single" w:color="AAAAAA" w:sz="1"/>
-              <w:bottom w:val="single" w:color="AAAAAA" w:sz="1"/>
-              <w:right w:val="single" w:color="AAAAAA" w:sz="1"/>
-            </w:tcBorders>
-            <w:tcMar>
-              <w:top w:w="60" w:type="dxa"/>
-              <w:left w:w="100" w:type="dxa"/>
-              <w:bottom w:w="60" w:type="dxa"/>
-              <w:right w:w="100" w:type="dxa"/>
-            </w:tcMar>
-          </w:tcPr>
-          <w:p>
-            <w:pPr>
-              <w:pStyle w:val="Normal"/>
-            </w:pPr>
-            <w:r>
-              <w:rPr>
-                <w:rFonts w:ascii="Arial" w:hAnsi="Arial" w:eastAsia="Arial" w:cs="Arial"/>
-                <w:noProof w:val="0"/>
-                <w:sz w:val="20"/>
-                <w:szCs w:val="20"/>
-                <w:lang w:val="en-US"/>
-              </w:rPr>
-              <w:t>created_at</w:t>
-            </w:r>
-          </w:p>
-        </w:tc>
-        <w:tc>
-          <w:tcPr>
-            <w:tcW w:w="1800" w:type="dxa"/>
-            <w:tcBorders>
-              <w:top w:val="single" w:color="AAAAAA" w:sz="1"/>
-              <w:left w:val="single" w:color="AAAAAA" w:sz="1"/>
-              <w:bottom w:val="single" w:color="AAAAAA" w:sz="1"/>
-              <w:right w:val="single" w:color="AAAAAA" w:sz="1"/>
-            </w:tcBorders>
-            <w:tcMar>
-              <w:top w:w="60" w:type="dxa"/>
-              <w:left w:w="100" w:type="dxa"/>
-              <w:bottom w:w="60" w:type="dxa"/>
-              <w:right w:w="100" w:type="dxa"/>
-            </w:tcMar>
-          </w:tcPr>
-          <w:p>
-            <w:pPr>
-              <w:pStyle w:val="Normal"/>
-            </w:pPr>
-            <w:r>
-              <w:rPr>
-                <w:rFonts w:ascii="Arial" w:hAnsi="Arial" w:eastAsia="Arial" w:cs="Arial"/>
-                <w:noProof w:val="0"/>
-                <w:sz w:val="20"/>
-                <w:szCs w:val="20"/>
-                <w:lang w:val="en-US"/>
-              </w:rPr>
-              <w:t>TIMESTAMP</w:t>
-            </w:r>
-          </w:p>
-        </w:tc>
-        <w:tc>
-          <w:tcPr>
-            <w:tcW w:w="1200" w:type="dxa"/>
-            <w:tcBorders>
-              <w:top w:val="single" w:color="AAAAAA" w:sz="1"/>
-              <w:left w:val="single" w:color="AAAAAA" w:sz="1"/>
-              <w:bottom w:val="single" w:color="AAAAAA" w:sz="1"/>
-              <w:right w:val="single" w:color="AAAAAA" w:sz="1"/>
-            </w:tcBorders>
-            <w:tcMar>
-              <w:top w:w="60" w:type="dxa"/>
-              <w:left w:w="100" w:type="dxa"/>
-              <w:bottom w:w="60" w:type="dxa"/>
-              <w:right w:w="100" w:type="dxa"/>
-            </w:tcMar>
-          </w:tcPr>
-          <w:p>
-            <w:pPr>
-              <w:rPr>
-                <w:sz w:val="20"/>
-                <w:szCs w:val="20"/>
-              </w:rPr>
-            </w:pPr>
-            <w:r>
-              <w:rPr>
-                <w:sz w:val="20"/>
-                <w:szCs w:val="20"/>
-              </w:rPr>
-              <w:t>NE</w:t>
-            </w:r>
-          </w:p>
-        </w:tc>
-        <w:tc>
-          <w:tcPr>
-            <w:tcW w:w="3826" w:type="dxa"/>
-            <w:tcBorders>
-              <w:top w:val="single" w:color="AAAAAA" w:sz="1"/>
-              <w:left w:val="single" w:color="AAAAAA" w:sz="1"/>
-              <w:bottom w:val="single" w:color="AAAAAA" w:sz="1"/>
-              <w:right w:val="single" w:color="AAAAAA" w:sz="1"/>
-            </w:tcBorders>
-            <w:tcMar>
-              <w:top w:w="60" w:type="dxa"/>
-              <w:left w:w="100" w:type="dxa"/>
-              <w:bottom w:w="60" w:type="dxa"/>
-              <w:right w:w="100" w:type="dxa"/>
-            </w:tcMar>
-          </w:tcPr>
-          <w:p>
-            <w:pPr>
-              <w:pStyle w:val="Normal"/>
-            </w:pPr>
-            <w:r>
-              <w:rPr>
-                <w:rFonts w:ascii="Arial" w:hAnsi="Arial" w:eastAsia="Arial" w:cs="Arial"/>
-                <w:noProof w:val="0"/>
-                <w:sz w:val="20"/>
-                <w:szCs w:val="20"/>
-                <w:lang w:val="en-US"/>
+              <w:top w:val="single" w:color="AAAAAA" w:sz="1" w:space="0"/>
+              <w:left w:val="single" w:color="AAAAAA" w:sz="1" w:space="0"/>
+              <w:bottom w:val="single" w:color="AAAAAA" w:sz="1" w:space="0"/>
+              <w:right w:val="single" w:color="AAAAAA" w:sz="1" w:space="0"/>
+            </w:tcBorders>
+            <w:tcMar>
+              <w:top w:w="60" w:type="dxa"/>
+              <w:left w:w="100" w:type="dxa"/>
+              <w:bottom w:w="60" w:type="dxa"/>
+              <w:right w:w="100" w:type="dxa"/>
+            </w:tcMar>
+          </w:tcPr>
+          <w:p>
+            <w:r>
+              <w:rPr>
+                <w:sz w:val="20"/>
+                <w:szCs w:val="20"/>
               </w:rPr>
               <w:t>Datum kreiranja</w:t>
             </w:r>
@@ -14322,6 +13938,7 @@
                 <w:sz w:val="20"/>
                 <w:szCs w:val="20"/>
               </w:rPr>
+              <w:lastRenderedPageBreak/>
               <w:t>file_type</w:t>
             </w:r>
           </w:p>
@@ -14971,7 +14588,6 @@
         <w:pStyle w:val="Heading2"/>
       </w:pPr>
       <w:r>
-        <w:lastRenderedPageBreak/>
         <w:t xml:space="preserve">3.6 </w:t>
       </w:r>
       <w:r>
@@ -15286,7 +14902,7 @@
               </w:rPr>
               <w:t>composition</w:t>
             </w:r>
-            <w:commentRangeStart w:id="15"/>
+            <w:commentRangeStart w:id="13"/>
             <w:r>
               <w:rPr>
                 <w:sz w:val="20"/>
@@ -15294,14 +14910,14 @@
               </w:rPr>
               <w:t>_id</w:t>
             </w:r>
-            <w:commentRangeEnd w:id="15"/>
+            <w:commentRangeEnd w:id="13"/>
             <w:r>
               <w:rPr>
                 <w:rStyle w:val="CommentReference"/>
                 <w:sz w:val="22"/>
                 <w:szCs w:val="22"/>
               </w:rPr>
-              <w:commentReference w:id="15"/>
+              <w:commentReference w:id="13"/>
             </w:r>
           </w:p>
         </w:tc>
@@ -16970,6 +16586,7 @@
                 <w:sz w:val="20"/>
                 <w:szCs w:val="20"/>
               </w:rPr>
+              <w:lastRenderedPageBreak/>
               <w:t>setlist_id</w:t>
             </w:r>
           </w:p>
@@ -19851,7 +19468,7 @@
                 <w:lang w:val="pl-PL"/>
               </w:rPr>
             </w:pPr>
-            <w:commentRangeStart w:id="16"/>
+            <w:commentRangeStart w:id="14"/>
             <w:r>
               <w:rPr>
                 <w:sz w:val="20"/>
@@ -19860,7 +19477,7 @@
               </w:rPr>
               <w:t>Odrađeno za taj dan (default: false)</w:t>
             </w:r>
-            <w:commentRangeEnd w:id="16"/>
+            <w:commentRangeEnd w:id="14"/>
             <w:r>
               <w:rPr>
                 <w:rStyle w:val="CommentReference"/>
@@ -19868,7 +19485,7 @@
                 <w:szCs w:val="22"/>
                 <w:lang w:val="pl-PL"/>
               </w:rPr>
-              <w:commentReference w:id="16"/>
+              <w:commentReference w:id="14"/>
             </w:r>
           </w:p>
         </w:tc>
@@ -22573,36 +22190,24 @@
           </w:tcPr>
           <w:p>
             <w:pPr>
-              <w:pStyle w:val="Normal"/>
-              <w:rPr>
-                <w:b w:val="1"/>
-                <w:bCs w:val="1"/>
+              <w:rPr>
+                <w:b/>
+                <w:bCs/>
                 <w:sz w:val="20"/>
                 <w:szCs w:val="20"/>
               </w:rPr>
             </w:pPr>
             <w:r>
               <w:rPr>
-                <w:b w:val="0"/>
-                <w:bCs w:val="0"/>
-                <w:sz w:val="20"/>
-                <w:szCs w:val="20"/>
-              </w:rPr>
-              <w:t xml:space="preserve">Artist </w:t>
-            </w:r>
-            <w:r>
-              <w:rPr>
-                <w:b w:val="0"/>
-                <w:bCs w:val="0"/>
-                <w:sz w:val="20"/>
-                <w:szCs w:val="20"/>
-              </w:rPr>
-              <w:t>→</w:t>
-            </w:r>
-            <w:r>
-              <w:rPr>
-                <w:b w:val="1"/>
-                <w:bCs w:val="1"/>
+                <w:sz w:val="20"/>
+                <w:szCs w:val="20"/>
+              </w:rPr>
+              <w:t>Artist →</w:t>
+            </w:r>
+            <w:r>
+              <w:rPr>
+                <w:b/>
+                <w:bCs/>
                 <w:sz w:val="20"/>
                 <w:szCs w:val="20"/>
               </w:rPr>
@@ -22610,8 +22215,6 @@
             </w:r>
             <w:r>
               <w:rPr>
-                <w:b w:val="0"/>
-                <w:bCs w:val="0"/>
                 <w:sz w:val="20"/>
                 <w:szCs w:val="20"/>
               </w:rPr>
@@ -22636,16 +22239,10 @@
             </w:tcMar>
           </w:tcPr>
           <w:p>
-            <w:pPr>
-              <w:pStyle w:val="Normal"/>
-            </w:pPr>
-            <w:r>
-              <w:rPr>
-                <w:rFonts w:ascii="Arial" w:hAnsi="Arial" w:eastAsia="Arial" w:cs="Arial"/>
-                <w:noProof w:val="0"/>
-                <w:sz w:val="20"/>
-                <w:szCs w:val="20"/>
-                <w:lang w:val="en-US"/>
+            <w:r>
+              <w:rPr>
+                <w:sz w:val="20"/>
+                <w:szCs w:val="20"/>
               </w:rPr>
               <w:t>1 : N</w:t>
             </w:r>
@@ -22668,13 +22265,8 @@
             </w:tcMar>
           </w:tcPr>
           <w:p>
-            <w:pPr>
-              <w:pStyle w:val="Normal"/>
-            </w:pPr>
-            <w:r>
-              <w:rPr>
-                <w:rFonts w:ascii="Arial" w:hAnsi="Arial" w:eastAsia="Arial" w:cs="Arial"/>
-                <w:noProof w:val="0"/>
+            <w:r>
+              <w:rPr>
                 <w:sz w:val="20"/>
                 <w:szCs w:val="20"/>
                 <w:lang w:val="pl-PL"/>
@@ -22918,7 +22510,7 @@
       </w:r>
     </w:p>
   </w:comment>
-  <w:comment w:initials="LB" w:author="Ljiljana Brkić" w:date="2026-03-09T09:15:00Z" w:id="14">
+  <w:comment w:initials="LB" w:author="Ljiljana Brkić" w:date="2026-03-09T09:15:00Z" w:id="11">
     <w:p>
       <w:pPr>
         <w:pStyle w:val="CommentText"/>
@@ -22937,7 +22529,7 @@
       </w:r>
     </w:p>
   </w:comment>
-  <w:comment w:initials="LB" w:author="Ljiljana Brkić" w:date="2026-03-09T10:23:00Z" w:id="15">
+  <w:comment w:initials="LB" w:author="Ljiljana Brkić" w:date="2026-03-09T10:23:00Z" w:id="13">
     <w:p>
       <w:pPr>
         <w:pStyle w:val="CommentText"/>
@@ -22956,7 +22548,7 @@
       </w:r>
     </w:p>
   </w:comment>
-  <w:comment w:initials="LB" w:author="Ljiljana Brkić" w:date="2026-03-09T09:23:00Z" w:id="16">
+  <w:comment w:initials="LB" w:author="Ljiljana Brkić" w:date="2026-03-09T09:23:00Z" w:id="14">
     <w:p>
       <w:pPr>
         <w:pStyle w:val="CommentText"/>
@@ -24236,19 +23828,17 @@
 </file>
 
 <file path=customXml/item1.xml><?xml version="1.0" encoding="utf-8"?>
-<p:properties xmlns:p="http://schemas.microsoft.com/office/2006/metadata/properties" xmlns:xsi="http://www.w3.org/2001/XMLSchema-instance" xmlns:pc="http://schemas.microsoft.com/office/infopath/2007/PartnerControls">
-  <documentManagement>
-    <TaxCatchAll xmlns="072f1ea6-7ad1-4e7d-9a60-2a24dd88e10e" xsi:nil="true"/>
-    <lcf76f155ced4ddcb4097134ff3c332f xmlns="7d95d725-3da7-44d0-a2fb-3e23234e5d3c">
-      <Terms xmlns="http://schemas.microsoft.com/office/infopath/2007/PartnerControls"/>
-    </lcf76f155ced4ddcb4097134ff3c332f>
-  </documentManagement>
-</p:properties>
+<?mso-contentType ?>
+<FormTemplates xmlns="http://schemas.microsoft.com/sharepoint/v3/contenttype/forms">
+  <Display>DocumentLibraryForm</Display>
+  <Edit>DocumentLibraryForm</Edit>
+  <New>DocumentLibraryForm</New>
+</FormTemplates>
 </file>
 
 <file path=customXml/item2.xml><?xml version="1.0" encoding="utf-8"?>
-<ct:contentTypeSchema xmlns:ct="http://schemas.microsoft.com/office/2006/metadata/contentType" xmlns:ma="http://schemas.microsoft.com/office/2006/metadata/properties/metaAttributes" ct:_="" ma:_="" ma:contentTypeName="Dokument" ma:contentTypeID="0x0101003A2C8DCA4ADB4D44A09DE63A4135C2E2" ma:contentTypeVersion="14" ma:contentTypeDescription="Stvaranje novog dokumenta." ma:contentTypeScope="" ma:versionID="3c271f0a48a8579a54d62d37b83fe3d3">
-  <xsd:schema xmlns:xsd="http://www.w3.org/2001/XMLSchema" xmlns:xs="http://www.w3.org/2001/XMLSchema" xmlns:p="http://schemas.microsoft.com/office/2006/metadata/properties" xmlns:ns2="7d95d725-3da7-44d0-a2fb-3e23234e5d3c" xmlns:ns3="072f1ea6-7ad1-4e7d-9a60-2a24dd88e10e" targetNamespace="http://schemas.microsoft.com/office/2006/metadata/properties" ma:root="true" ma:fieldsID="dc828954f2f7e0aa9487bc661adb16c4" ns2:_="" ns3:_="">
+<ct:contentTypeSchema xmlns:ct="http://schemas.microsoft.com/office/2006/metadata/contentType" xmlns:ma="http://schemas.microsoft.com/office/2006/metadata/properties/metaAttributes" ct:_="" ma:_="" ma:contentTypeName="Document" ma:contentTypeID="0x0101003A2C8DCA4ADB4D44A09DE63A4135C2E2" ma:contentTypeVersion="14" ma:contentTypeDescription="Create a new document." ma:contentTypeScope="" ma:versionID="3708ead8b18e6561e27465c703495b5e">
+  <xsd:schema xmlns:xsd="http://www.w3.org/2001/XMLSchema" xmlns:xs="http://www.w3.org/2001/XMLSchema" xmlns:p="http://schemas.microsoft.com/office/2006/metadata/properties" xmlns:ns2="7d95d725-3da7-44d0-a2fb-3e23234e5d3c" xmlns:ns3="072f1ea6-7ad1-4e7d-9a60-2a24dd88e10e" targetNamespace="http://schemas.microsoft.com/office/2006/metadata/properties" ma:root="true" ma:fieldsID="0e58647d09b4fb1e5cde8b45bda60dc6" ns2:_="" ns3:_="">
     <xsd:import namespace="7d95d725-3da7-44d0-a2fb-3e23234e5d3c"/>
     <xsd:import namespace="072f1ea6-7ad1-4e7d-9a60-2a24dd88e10e"/>
     <xsd:element name="properties">
@@ -24290,7 +23880,7 @@
         <xsd:restriction base="dms:Note"/>
       </xsd:simpleType>
     </xsd:element>
-    <xsd:element name="lcf76f155ced4ddcb4097134ff3c332f" ma:index="11" nillable="true" ma:taxonomy="true" ma:internalName="lcf76f155ced4ddcb4097134ff3c332f" ma:taxonomyFieldName="MediaServiceImageTags" ma:displayName="Oznake slika" ma:readOnly="false" ma:fieldId="{5cf76f15-5ced-4ddc-b409-7134ff3c332f}" ma:taxonomyMulti="true" ma:sspId="6d51dc5d-6cba-4748-b546-1c911b97607f" ma:termSetId="09814cd3-568e-fe90-9814-8d621ff8fb84" ma:anchorId="fba54fb3-c3e1-fe81-a776-ca4b69148c4d" ma:open="true" ma:isKeyword="false">
+    <xsd:element name="lcf76f155ced4ddcb4097134ff3c332f" ma:index="11" nillable="true" ma:taxonomy="true" ma:internalName="lcf76f155ced4ddcb4097134ff3c332f" ma:taxonomyFieldName="MediaServiceImageTags" ma:displayName="Image Tags" ma:readOnly="false" ma:fieldId="{5cf76f15-5ced-4ddc-b409-7134ff3c332f}" ma:taxonomyMulti="true" ma:sspId="6d51dc5d-6cba-4748-b546-1c911b97607f" ma:termSetId="09814cd3-568e-fe90-9814-8d621ff8fb84" ma:anchorId="fba54fb3-c3e1-fe81-a776-ca4b69148c4d" ma:open="true" ma:isKeyword="false">
       <xsd:complexType>
         <xsd:sequence>
           <xsd:element ref="pc:Terms" minOccurs="0" maxOccurs="1"/>
@@ -24349,7 +23939,7 @@
         </xsd:complexContent>
       </xsd:complexType>
     </xsd:element>
-    <xsd:element name="SharedWithUsers" ma:index="19" nillable="true" ma:displayName="Zajednički se koristi s" ma:internalName="SharedWithUsers" ma:readOnly="true">
+    <xsd:element name="SharedWithUsers" ma:index="19" nillable="true" ma:displayName="Shared With" ma:internalName="SharedWithUsers" ma:readOnly="true">
       <xsd:complexType>
         <xsd:complexContent>
           <xsd:extension base="dms:UserMulti">
@@ -24368,7 +23958,7 @@
         </xsd:complexContent>
       </xsd:complexType>
     </xsd:element>
-    <xsd:element name="SharedWithDetails" ma:index="20" nillable="true" ma:displayName="Detalji o zajedničkom korištenju" ma:internalName="SharedWithDetails" ma:readOnly="true">
+    <xsd:element name="SharedWithDetails" ma:index="20" nillable="true" ma:displayName="Shared With Details" ma:internalName="SharedWithDetails" ma:readOnly="true">
       <xsd:simpleType>
         <xsd:restriction base="dms:Note">
           <xsd:maxLength value="255"/>
@@ -24385,8 +23975,8 @@
         <xsd:element ref="dc:creator" minOccurs="0" maxOccurs="1"/>
         <xsd:element ref="dcterms:created" minOccurs="0" maxOccurs="1"/>
         <xsd:element ref="dc:identifier" minOccurs="0" maxOccurs="1"/>
-        <xsd:element name="contentType" minOccurs="0" maxOccurs="1" type="xsd:string" ma:index="0" ma:displayName="Vrsta sadržaja"/>
-        <xsd:element ref="dc:title" minOccurs="0" maxOccurs="1" ma:index="4" ma:displayName="Naslov"/>
+        <xsd:element name="contentType" minOccurs="0" maxOccurs="1" type="xsd:string" ma:index="0" ma:displayName="Content Type"/>
+        <xsd:element ref="dc:title" minOccurs="0" maxOccurs="1" ma:index="4" ma:displayName="Title"/>
         <xsd:element ref="dc:subject" minOccurs="0" maxOccurs="1"/>
         <xsd:element ref="dc:description" minOccurs="0" maxOccurs="1"/>
         <xsd:element name="keywords" minOccurs="0" maxOccurs="1" type="xsd:string"/>
@@ -24476,15 +24066,29 @@
 </file>
 
 <file path=customXml/item3.xml><?xml version="1.0" encoding="utf-8"?>
-<?mso-contentType ?>
-<FormTemplates xmlns="http://schemas.microsoft.com/sharepoint/v3/contenttype/forms">
-  <Display>DocumentLibraryForm</Display>
-  <Edit>DocumentLibraryForm</Edit>
-  <New>DocumentLibraryForm</New>
-</FormTemplates>
+<p:properties xmlns:p="http://schemas.microsoft.com/office/2006/metadata/properties" xmlns:xsi="http://www.w3.org/2001/XMLSchema-instance" xmlns:pc="http://schemas.microsoft.com/office/infopath/2007/PartnerControls">
+  <documentManagement>
+    <TaxCatchAll xmlns="072f1ea6-7ad1-4e7d-9a60-2a24dd88e10e" xsi:nil="true"/>
+    <lcf76f155ced4ddcb4097134ff3c332f xmlns="7d95d725-3da7-44d0-a2fb-3e23234e5d3c">
+      <Terms xmlns="http://schemas.microsoft.com/office/infopath/2007/PartnerControls"/>
+    </lcf76f155ced4ddcb4097134ff3c332f>
+  </documentManagement>
+</p:properties>
 </file>
 
 <file path=customXml/itemProps1.xml><?xml version="1.0" encoding="utf-8"?>
+<ds:datastoreItem xmlns:ds="http://schemas.openxmlformats.org/officeDocument/2006/customXml" ds:itemID="{5447D846-7CF1-4D48-872A-BB44161D2BBE}">
+  <ds:schemaRefs>
+    <ds:schemaRef ds:uri="http://schemas.microsoft.com/sharepoint/v3/contenttype/forms"/>
+  </ds:schemaRefs>
+</ds:datastoreItem>
+</file>
+
+<file path=customXml/itemProps2.xml><?xml version="1.0" encoding="utf-8"?>
+<ds:datastoreItem xmlns:ds="http://schemas.openxmlformats.org/officeDocument/2006/customXml" ds:itemID="{F191C5EC-9A79-4982-8496-AE1443F01BF9}"/>
+</file>
+
+<file path=customXml/itemProps3.xml><?xml version="1.0" encoding="utf-8"?>
 <ds:datastoreItem xmlns:ds="http://schemas.openxmlformats.org/officeDocument/2006/customXml" ds:itemID="{9DC9C3B2-034D-46CA-85D8-F05460103D42}">
   <ds:schemaRefs>
     <ds:schemaRef ds:uri="http://schemas.microsoft.com/office/2006/metadata/properties"/>
@@ -24493,16 +24097,4 @@
     <ds:schemaRef ds:uri="7d95d725-3da7-44d0-a2fb-3e23234e5d3c"/>
   </ds:schemaRefs>
 </ds:datastoreItem>
-</file>
-
-<file path=customXml/itemProps2.xml><?xml version="1.0" encoding="utf-8"?>
-<ds:datastoreItem xmlns:ds="http://schemas.openxmlformats.org/officeDocument/2006/customXml" ds:itemID="{943D7026-75F5-4787-9637-F5E291343DDF}"/>
-</file>
-
-<file path=customXml/itemProps3.xml><?xml version="1.0" encoding="utf-8"?>
-<ds:datastoreItem xmlns:ds="http://schemas.openxmlformats.org/officeDocument/2006/customXml" ds:itemID="{5447D846-7CF1-4D48-872A-BB44161D2BBE}">
-  <ds:schemaRefs>
-    <ds:schemaRef ds:uri="http://schemas.microsoft.com/sharepoint/v3/contenttype/forms"/>
-  </ds:schemaRefs>
-</ds:datastoreItem>
 </file>
</xml_diff>